<commit_message>
Checkpoint 4.1: paper/chunk/tool graph schema with duplicate_of edges
Replace file nodes and version_of with duplicate_of between paper nodes, re-run
the evaluation and traces on the final code, refresh screenshots, worksheet
Steps 3-4 and READMEs, and add the unmodified course starter for comparison.
</commit_message>
<xml_diff>
--- a/Capstone_Checkpoint_4.1/Tarundeep_Required_Capstone_Checkpoint_4_1_Worksheet.docx
+++ b/Capstone_Checkpoint_4.1/Tarundeep_Required_Capstone_Checkpoint_4_1_Worksheet.docx
@@ -1883,7 +1883,7 @@
                 <w:sz w:val="24"/>
                 <w:szCs w:val="24"/>
               </w:rPr>
-              <w:t xml:space="preserve">Nodes for papers, files, chunks, topics and entities (tool names such as FairSquare); edges for same-paper copies, chunk order, shared topics and shared tools. Hop 1 finds candidate papers (duplicates merged); hop 2 searches inside them for the exact passage; the graph then adds neighbouring chunks and related papers, labelled PRIMARY or CONTEXT in the prompt.</w:t>
+              <w:t xml:space="preserve">Nodes: paper (one per PDF, with its title), chunk (the text passages) and tool (the systems papers introduce or compare against). Edges: has_chunk and next_chunk (each paper's passages in reading order), duplicate_of (a conference/arXiv copy points to the published paper), introduces and compares_against (paper → tool). Hop 1 finds candidate papers; hop 2 searches inside them for the exact passage; the graph then adds the following passages, labelled PRIMARY or CONTEXT in the prompt.</w:t>
             </w:r>
           </w:p>
           <w:p>
@@ -2232,7 +2232,7 @@
                 <w:sz w:val="24"/>
                 <w:szCs w:val="24"/>
               </w:rPr>
-              <w:t xml:space="preserve">Simply raising top-k (e.g. to 20) would include chunk 55 but floods the LLM with loosely related text and still misses Q2, whose evidence was outside the top 20. Author and citation edges were not used: the parser did not keep author lists or references, and one author appears on most papers, so these edges would connect almost everything.</w:t>
+              <w:t xml:space="preserve">Simply raising top-k (e.g. to 20) would include chunk 55 but floods the LLM with loosely related text and still misses Q2, whose evidence was outside the top 20. Other relationships the starter suggests were left out: shared authors (one author is on most papers, so the edge connects almost everything; the parser also did not keep author lists), citations (would need re-parsing reference lists, and no failure involved them), and shared-keyword topics (tried; they linked VeriFair to an unrelated RNA paper via “LSTM”).</w:t>
             </w:r>
           </w:p>
           <w:p>
@@ -2500,7 +2500,7 @@
                 <w:sz w:val="24"/>
                 <w:szCs w:val="24"/>
               </w:rPr>
-              <w:t xml:space="preserve">(networkx, built in ~1 s at startup). Nodes: paper (119), file (148), chunk (8,087), tool (458). Edges: version_of merges the 29 duplicate copies into one paper; has_chunk / next_chunk keep each paper's reading order, like an email thread in Lab 4.2; introduces and compares_against (409 edges) link a paper to the baseline tools it compares against, storing the baseline's technique and the limitation the paper claims. These tool relations are extracted once by the LLM from each paper's comparison sentences and cached.</w:t>
+              <w:t xml:space="preserve">(networkx, built in ~1 s at startup). Nodes: paper (148, one per PDF), chunk (8,087), tool (458). Edges: has_chunk and next_chunk keep each paper's passages in reading order, like an email thread in Lab 4.2; duplicate_of (29) points each conference/arXiv copy to its published paper, so retrieval searches 119 distinct papers; introduces (95) and compares_against (409) link a paper to its own tool and to the baselines it compares against, storing the baseline's technique and the limitation the paper claims. The tool relations are extracted once by the LLM from each paper's comparison sentences and cached.</w:t>
             </w:r>
           </w:p>
           <w:p>
@@ -2806,7 +2806,7 @@
             <w:r>
               <w:drawing>
                 <wp:inline distT="0" distB="0" distL="0" distR="0">
-                  <wp:extent cx="6035040" cy="3311400"/>
+                  <wp:extent cx="6035040" cy="3222186"/>
                   <wp:docPr id="9001" name="Figure 1"/>
                   <a:graphic xmlns:a="http://schemas.openxmlformats.org/drawingml/2006/main">
                     <a:graphicData uri="http://schemas.openxmlformats.org/drawingml/2006/picture">
@@ -2824,7 +2824,7 @@
                         <pic:spPr>
                           <a:xfrm>
                             <a:off x="0" y="0"/>
-                            <a:ext cx="6035040" cy="3311400"/>
+                            <a:ext cx="6035040" cy="3222186"/>
                           </a:xfrm>
                           <a:prstGeom prst="rect">
                             <a:avLst/>
@@ -2932,7 +2932,7 @@
             <w:r>
               <w:drawing>
                 <wp:inline distT="0" distB="0" distL="0" distR="0">
-                  <wp:extent cx="6035040" cy="2330050"/>
+                  <wp:extent cx="6035040" cy="2419263"/>
                   <wp:docPr id="9003" name="Figure 3"/>
                   <a:graphic xmlns:a="http://schemas.openxmlformats.org/drawingml/2006/main">
                     <a:graphicData uri="http://schemas.openxmlformats.org/drawingml/2006/picture">
@@ -2950,7 +2950,7 @@
                         <pic:spPr>
                           <a:xfrm>
                             <a:off x="0" y="0"/>
-                            <a:ext cx="6035040" cy="2330050"/>
+                            <a:ext cx="6035040" cy="2419263"/>
                           </a:xfrm>
                           <a:prstGeom prst="rect">
                             <a:avLst/>

</xml_diff>

<commit_message>
Checkpoint 4.1 worksheet: add Step 5 results and GitHub links to the evidence
</commit_message>
<xml_diff>
--- a/Capstone_Checkpoint_4.1/Tarundeep_Required_Capstone_Checkpoint_4_1_Worksheet.docx
+++ b/Capstone_Checkpoint_4.1/Tarundeep_Required_Capstone_Checkpoint_4_1_Worksheet.docx
@@ -2768,11 +2768,183 @@
             </w:pPr>
             <w:r>
               <w:rPr>
-                <w:sz w:val="24"/>
-                <w:szCs w:val="24"/>
-              </w:rPr>
-              <w:t xml:space="preserve">Code: Capstone_Checkpoint_4.1/capstone_checkpoint_4_1_advanced_retrieval_starter.py (PaperGraph, extract_relations, plan_query, GraphMultiHopRetriever). Full retrieval log: checkpoint_4_1_responses.log.</w:t>
-            </w:r>
+                <w:b/>
+                <w:bCs/>
+                <w:sz w:val="24"/>
+                <w:szCs w:val="24"/>
+              </w:rPr>
+              <w:t xml:space="preserve">Repository: </w:t>
+            </w:r>
+            <w:hyperlink r:id="rIdLnk1035a2b7e6">
+              <w:r>
+                <w:rPr>
+                  <w:color w:val="0563C1"/>
+                  <w:u w:val="single"/>
+                  <w:sz w:val="24"/>
+                  <w:szCs w:val="24"/>
+                </w:rPr>
+                <w:t xml:space="preserve">github.com/Tsingh315/llm-rag-capstone → Capstone_Checkpoint_4.1</w:t>
+              </w:r>
+            </w:hyperlink>
+          </w:p>
+          <w:p>
+            <w:pPr>
+              <w:spacing w:after="120"/>
+              <w:ind w:left="360" w:hanging="200"/>
+              <w:rPr>
+                <w:sz w:val="24"/>
+                <w:szCs w:val="24"/>
+              </w:rPr>
+            </w:pPr>
+            <w:r>
+              <w:rPr>
+                <w:b/>
+                <w:bCs/>
+                <w:sz w:val="24"/>
+                <w:szCs w:val="24"/>
+              </w:rPr>
+              <w:t xml:space="preserve">• Code: </w:t>
+            </w:r>
+            <w:hyperlink r:id="rIdLnk4583a1bf24">
+              <w:r>
+                <w:rPr>
+                  <w:color w:val="0563C1"/>
+                  <w:u w:val="single"/>
+                  <w:sz w:val="24"/>
+                  <w:szCs w:val="24"/>
+                </w:rPr>
+                <w:t xml:space="preserve">capstone_checkpoint_4_1_advanced_retrieval_starter.py</w:t>
+              </w:r>
+            </w:hyperlink>
+            <w:r>
+              <w:rPr>
+                <w:sz w:val="24"/>
+                <w:szCs w:val="24"/>
+              </w:rPr>
+              <w:t xml:space="preserve"> (PaperGraph, extract_relations, plan_query, GraphMultiHopRetriever)</w:t>
+            </w:r>
+          </w:p>
+          <w:p>
+            <w:pPr>
+              <w:spacing w:after="120"/>
+              <w:ind w:left="360" w:hanging="200"/>
+              <w:rPr>
+                <w:sz w:val="24"/>
+                <w:szCs w:val="24"/>
+              </w:rPr>
+            </w:pPr>
+            <w:r>
+              <w:rPr>
+                <w:b/>
+                <w:bCs/>
+                <w:sz w:val="24"/>
+                <w:szCs w:val="24"/>
+              </w:rPr>
+              <w:t xml:space="preserve">• Retrieval log: </w:t>
+            </w:r>
+            <w:hyperlink r:id="rIdLnk991295564a">
+              <w:r>
+                <w:rPr>
+                  <w:color w:val="0563C1"/>
+                  <w:u w:val="single"/>
+                  <w:sz w:val="24"/>
+                  <w:szCs w:val="24"/>
+                </w:rPr>
+                <w:t xml:space="preserve">checkpoint_4_1_responses.log</w:t>
+              </w:r>
+            </w:hyperlink>
+            <w:r>
+              <w:rPr>
+                <w:sz w:val="24"/>
+                <w:szCs w:val="24"/>
+              </w:rPr>
+              <w:t xml:space="preserve"> (per question and system: sub-queries, scope, papers, PRIMARY/CONTEXT chunks, answer, verdict)</w:t>
+            </w:r>
+          </w:p>
+          <w:p>
+            <w:pPr>
+              <w:spacing w:after="120"/>
+              <w:ind w:left="360" w:hanging="200"/>
+              <w:rPr>
+                <w:sz w:val="24"/>
+                <w:szCs w:val="24"/>
+              </w:rPr>
+            </w:pPr>
+            <w:r>
+              <w:rPr>
+                <w:b/>
+                <w:bCs/>
+                <w:sz w:val="24"/>
+                <w:szCs w:val="24"/>
+              </w:rPr>
+              <w:t xml:space="preserve">• Results: </w:t>
+            </w:r>
+            <w:hyperlink r:id="rIdLnkdcd744cb1a">
+              <w:r>
+                <w:rPr>
+                  <w:color w:val="0563C1"/>
+                  <w:u w:val="single"/>
+                  <w:sz w:val="24"/>
+                  <w:szCs w:val="24"/>
+                </w:rPr>
+                <w:t xml:space="preserve">checkpoint_4_1_run_output.txt</w:t>
+              </w:r>
+            </w:hyperlink>
+            <w:r>
+              <w:rPr>
+                <w:sz w:val="24"/>
+                <w:szCs w:val="24"/>
+              </w:rPr>
+              <w:t xml:space="preserve"> (summary tables) and </w:t>
+            </w:r>
+            <w:hyperlink r:id="rIdLnk5a759deef4">
+              <w:r>
+                <w:rPr>
+                  <w:color w:val="0563C1"/>
+                  <w:u w:val="single"/>
+                  <w:sz w:val="24"/>
+                  <w:szCs w:val="24"/>
+                </w:rPr>
+                <w:t xml:space="preserve">checkpoint_4_1_results.json</w:t>
+              </w:r>
+            </w:hyperlink>
+            <w:r>
+              <w:rPr>
+                <w:sz w:val="24"/>
+                <w:szCs w:val="24"/>
+              </w:rPr>
+              <w:t xml:space="preserve"> (every run)</w:t>
+            </w:r>
+          </w:p>
+          <w:p>
+            <w:pPr>
+              <w:spacing w:after="120"/>
+              <w:ind w:left="360" w:hanging="200"/>
+              <w:rPr>
+                <w:sz w:val="24"/>
+                <w:szCs w:val="24"/>
+              </w:rPr>
+            </w:pPr>
+            <w:r>
+              <w:rPr>
+                <w:b/>
+                <w:bCs/>
+                <w:sz w:val="24"/>
+                <w:szCs w:val="24"/>
+              </w:rPr>
+              <w:t xml:space="preserve">• Unmodified course starter, for comparison: </w:t>
+            </w:r>
+            <w:hyperlink r:id="rIdLnk6a26a7a686">
+              <w:r>
+                <w:rPr>
+                  <w:color w:val="0563C1"/>
+                  <w:u w:val="single"/>
+                  <w:sz w:val="24"/>
+                  <w:szCs w:val="24"/>
+                </w:rPr>
+                <w:t xml:space="preserve">capstone_checkpoint_4_1_advanced_retrieval_starter_ORIGINAL.py</w:t>
+              </w:r>
+            </w:hyperlink>
           </w:p>
           <w:p>
             <w:pPr>
@@ -3196,15 +3368,25 @@
           </w:tcPr>
           <w:p>
             <w:pPr>
-              <w:rPr>
-                <w:rFonts w:eastAsia="Aptos"/>
+              <w:spacing w:after="40"/>
+              <w:rPr>
                 <w:b/>
                 <w:bCs/>
                 <w:color w:val="000000"/>
-                <w:sz w:val="24"/>
-                <w:szCs w:val="24"/>
-              </w:rPr>
-            </w:pPr>
+                <w:sz w:val="22"/>
+                <w:szCs w:val="22"/>
+              </w:rPr>
+            </w:pPr>
+            <w:r>
+              <w:rPr>
+                <w:b/>
+                <w:bCs/>
+                <w:color w:val="000000"/>
+                <w:sz w:val="22"/>
+                <w:szCs w:val="22"/>
+              </w:rPr>
+              <w:t xml:space="preserve">Judge pass rate (3.1 set Q1–Q4, mean of 3 runs)</w:t>
+            </w:r>
           </w:p>
         </w:tc>
         <w:tc>
@@ -3213,15 +3395,21 @@
           </w:tcPr>
           <w:p>
             <w:pPr>
-              <w:rPr>
-                <w:rFonts w:eastAsia="Aptos"/>
-                <w:b/>
-                <w:bCs/>
+              <w:spacing w:after="40"/>
+              <w:rPr>
                 <w:color w:val="000000"/>
-                <w:sz w:val="24"/>
-                <w:szCs w:val="24"/>
-              </w:rPr>
-            </w:pPr>
+                <w:sz w:val="22"/>
+                <w:szCs w:val="22"/>
+              </w:rPr>
+            </w:pPr>
+            <w:r>
+              <w:rPr>
+                <w:color w:val="000000"/>
+                <w:sz w:val="22"/>
+                <w:szCs w:val="22"/>
+              </w:rPr>
+              <w:t xml:space="preserve">1.00 / 4 (same at k=5 and k=8)</w:t>
+            </w:r>
           </w:p>
         </w:tc>
         <w:tc>
@@ -3230,15 +3418,21 @@
           </w:tcPr>
           <w:p>
             <w:pPr>
-              <w:rPr>
-                <w:rFonts w:eastAsia="Aptos"/>
-                <w:b/>
-                <w:bCs/>
+              <w:spacing w:after="40"/>
+              <w:rPr>
                 <w:color w:val="000000"/>
-                <w:sz w:val="24"/>
-                <w:szCs w:val="24"/>
-              </w:rPr>
-            </w:pPr>
+                <w:sz w:val="22"/>
+                <w:szCs w:val="22"/>
+              </w:rPr>
+            </w:pPr>
+            <w:r>
+              <w:rPr>
+                <w:color w:val="000000"/>
+                <w:sz w:val="22"/>
+                <w:szCs w:val="22"/>
+              </w:rPr>
+              <w:t xml:space="preserve">3.00 / 4</w:t>
+            </w:r>
           </w:p>
         </w:tc>
       </w:tr>
@@ -3249,15 +3443,25 @@
           </w:tcPr>
           <w:p>
             <w:pPr>
-              <w:rPr>
-                <w:rFonts w:eastAsia="Aptos"/>
+              <w:spacing w:after="40"/>
+              <w:rPr>
                 <w:b/>
                 <w:bCs/>
                 <w:color w:val="000000"/>
-                <w:sz w:val="24"/>
-                <w:szCs w:val="24"/>
-              </w:rPr>
-            </w:pPr>
+                <w:sz w:val="22"/>
+                <w:szCs w:val="22"/>
+              </w:rPr>
+            </w:pPr>
+            <w:r>
+              <w:rPr>
+                <w:b/>
+                <w:bCs/>
+                <w:color w:val="000000"/>
+                <w:sz w:val="22"/>
+                <w:szCs w:val="22"/>
+              </w:rPr>
+              <w:t xml:space="preserve">Passes per question, Q1 / Q2 / Q3 / Q4 (out of 3 runs)</w:t>
+            </w:r>
           </w:p>
         </w:tc>
         <w:tc>
@@ -3266,15 +3470,21 @@
           </w:tcPr>
           <w:p>
             <w:pPr>
-              <w:rPr>
-                <w:rFonts w:eastAsia="Aptos"/>
-                <w:b/>
-                <w:bCs/>
+              <w:spacing w:after="40"/>
+              <w:rPr>
                 <w:color w:val="000000"/>
-                <w:sz w:val="24"/>
-                <w:szCs w:val="24"/>
-              </w:rPr>
-            </w:pPr>
+                <w:sz w:val="22"/>
+                <w:szCs w:val="22"/>
+              </w:rPr>
+            </w:pPr>
+            <w:r>
+              <w:rPr>
+                <w:color w:val="000000"/>
+                <w:sz w:val="22"/>
+                <w:szCs w:val="22"/>
+              </w:rPr>
+              <w:t xml:space="preserve">0 / 0 / 0 / 3</w:t>
+            </w:r>
           </w:p>
         </w:tc>
         <w:tc>
@@ -3283,15 +3493,471 @@
           </w:tcPr>
           <w:p>
             <w:pPr>
-              <w:rPr>
-                <w:rFonts w:eastAsia="Aptos"/>
-                <w:b/>
-                <w:bCs/>
+              <w:spacing w:after="40"/>
+              <w:rPr>
                 <w:color w:val="000000"/>
-                <w:sz w:val="24"/>
-                <w:szCs w:val="24"/>
-              </w:rPr>
-            </w:pPr>
+                <w:sz w:val="22"/>
+                <w:szCs w:val="22"/>
+              </w:rPr>
+            </w:pPr>
+            <w:r>
+              <w:rPr>
+                <w:color w:val="000000"/>
+                <w:sz w:val="22"/>
+                <w:szCs w:val="22"/>
+              </w:rPr>
+              <w:t xml:space="preserve">3 / 0 / 3 / 3</w:t>
+            </w:r>
+          </w:p>
+        </w:tc>
+      </w:tr>
+      <w:tr>
+        <w:tc>
+          <w:tcPr>
+            <w:tcW w:w="3698" w:type="dxa"/>
+          </w:tcPr>
+          <w:p>
+            <w:pPr>
+              <w:spacing w:after="40"/>
+              <w:rPr>
+                <w:b/>
+                <w:bCs/>
+                <w:color w:val="000000"/>
+                <w:sz w:val="22"/>
+                <w:szCs w:val="22"/>
+              </w:rPr>
+            </w:pPr>
+            <w:r>
+              <w:rPr>
+                <w:b/>
+                <w:bCs/>
+                <w:color w:val="000000"/>
+                <w:sz w:val="22"/>
+                <w:szCs w:val="22"/>
+              </w:rPr>
+              <w:t xml:space="preserve">Answer evidence reached the LLM (exact answer sentence among the retrieved chunks)</w:t>
+            </w:r>
+          </w:p>
+        </w:tc>
+        <w:tc>
+          <w:tcPr>
+            <w:tcW w:w="3699" w:type="dxa"/>
+          </w:tcPr>
+          <w:p>
+            <w:pPr>
+              <w:spacing w:after="40"/>
+              <w:rPr>
+                <w:color w:val="000000"/>
+                <w:sz w:val="22"/>
+                <w:szCs w:val="22"/>
+              </w:rPr>
+            </w:pPr>
+            <w:r>
+              <w:rPr>
+                <w:color w:val="000000"/>
+                <w:sz w:val="22"/>
+                <w:szCs w:val="22"/>
+              </w:rPr>
+              <w:t xml:space="preserve">22%</w:t>
+            </w:r>
+          </w:p>
+        </w:tc>
+        <w:tc>
+          <w:tcPr>
+            <w:tcW w:w="3699" w:type="dxa"/>
+          </w:tcPr>
+          <w:p>
+            <w:pPr>
+              <w:spacing w:after="40"/>
+              <w:rPr>
+                <w:color w:val="000000"/>
+                <w:sz w:val="22"/>
+                <w:szCs w:val="22"/>
+              </w:rPr>
+            </w:pPr>
+            <w:r>
+              <w:rPr>
+                <w:color w:val="000000"/>
+                <w:sz w:val="22"/>
+                <w:szCs w:val="22"/>
+              </w:rPr>
+              <w:t xml:space="preserve">78%</w:t>
+            </w:r>
+          </w:p>
+        </w:tc>
+      </w:tr>
+      <w:tr>
+        <w:tc>
+          <w:tcPr>
+            <w:tcW w:w="3698" w:type="dxa"/>
+          </w:tcPr>
+          <w:p>
+            <w:pPr>
+              <w:spacing w:after="40"/>
+              <w:rPr>
+                <w:b/>
+                <w:bCs/>
+                <w:color w:val="000000"/>
+                <w:sz w:val="22"/>
+                <w:szCs w:val="22"/>
+              </w:rPr>
+            </w:pPr>
+            <w:r>
+              <w:rPr>
+                <w:b/>
+                <w:bCs/>
+                <w:color w:val="000000"/>
+                <w:sz w:val="22"/>
+                <w:szCs w:val="22"/>
+              </w:rPr>
+              <w:t xml:space="preserve">Expected papers retrieved</w:t>
+            </w:r>
+          </w:p>
+        </w:tc>
+        <w:tc>
+          <w:tcPr>
+            <w:tcW w:w="3699" w:type="dxa"/>
+          </w:tcPr>
+          <w:p>
+            <w:pPr>
+              <w:spacing w:after="40"/>
+              <w:rPr>
+                <w:color w:val="000000"/>
+                <w:sz w:val="22"/>
+                <w:szCs w:val="22"/>
+              </w:rPr>
+            </w:pPr>
+            <w:r>
+              <w:rPr>
+                <w:color w:val="000000"/>
+                <w:sz w:val="22"/>
+                <w:szCs w:val="22"/>
+              </w:rPr>
+              <w:t xml:space="preserve">50%</w:t>
+            </w:r>
+          </w:p>
+        </w:tc>
+        <w:tc>
+          <w:tcPr>
+            <w:tcW w:w="3699" w:type="dxa"/>
+          </w:tcPr>
+          <w:p>
+            <w:pPr>
+              <w:spacing w:after="40"/>
+              <w:rPr>
+                <w:color w:val="000000"/>
+                <w:sz w:val="22"/>
+                <w:szCs w:val="22"/>
+              </w:rPr>
+            </w:pPr>
+            <w:r>
+              <w:rPr>
+                <w:color w:val="000000"/>
+                <w:sz w:val="22"/>
+                <w:szCs w:val="22"/>
+              </w:rPr>
+              <w:t xml:space="preserve">72%</w:t>
+            </w:r>
+          </w:p>
+        </w:tc>
+      </w:tr>
+      <w:tr>
+        <w:tc>
+          <w:tcPr>
+            <w:tcW w:w="3698" w:type="dxa"/>
+          </w:tcPr>
+          <w:p>
+            <w:pPr>
+              <w:spacing w:after="40"/>
+              <w:rPr>
+                <w:b/>
+                <w:bCs/>
+                <w:color w:val="000000"/>
+                <w:sz w:val="22"/>
+                <w:szCs w:val="22"/>
+              </w:rPr>
+            </w:pPr>
+            <w:r>
+              <w:rPr>
+                <w:b/>
+                <w:bCs/>
+                <w:color w:val="000000"/>
+                <w:sz w:val="22"/>
+                <w:szCs w:val="22"/>
+              </w:rPr>
+              <w:t xml:space="preserve">Distinct passages sent (out of 8)</w:t>
+            </w:r>
+          </w:p>
+        </w:tc>
+        <w:tc>
+          <w:tcPr>
+            <w:tcW w:w="3699" w:type="dxa"/>
+          </w:tcPr>
+          <w:p>
+            <w:pPr>
+              <w:spacing w:after="40"/>
+              <w:rPr>
+                <w:color w:val="000000"/>
+                <w:sz w:val="22"/>
+                <w:szCs w:val="22"/>
+              </w:rPr>
+            </w:pPr>
+            <w:r>
+              <w:rPr>
+                <w:color w:val="000000"/>
+                <w:sz w:val="22"/>
+                <w:szCs w:val="22"/>
+              </w:rPr>
+              <w:t xml:space="preserve">6.5 (duplicate copies)</w:t>
+            </w:r>
+          </w:p>
+        </w:tc>
+        <w:tc>
+          <w:tcPr>
+            <w:tcW w:w="3699" w:type="dxa"/>
+          </w:tcPr>
+          <w:p>
+            <w:pPr>
+              <w:spacing w:after="40"/>
+              <w:rPr>
+                <w:color w:val="000000"/>
+                <w:sz w:val="22"/>
+                <w:szCs w:val="22"/>
+              </w:rPr>
+            </w:pPr>
+            <w:r>
+              <w:rPr>
+                <w:color w:val="000000"/>
+                <w:sz w:val="22"/>
+                <w:szCs w:val="22"/>
+              </w:rPr>
+              <w:t xml:space="preserve">8.0</w:t>
+            </w:r>
+          </w:p>
+        </w:tc>
+      </w:tr>
+      <w:tr>
+        <w:tc>
+          <w:tcPr>
+            <w:tcW w:w="3698" w:type="dxa"/>
+          </w:tcPr>
+          <w:p>
+            <w:pPr>
+              <w:spacing w:after="40"/>
+              <w:rPr>
+                <w:b/>
+                <w:bCs/>
+                <w:color w:val="000000"/>
+                <w:sz w:val="22"/>
+                <w:szCs w:val="22"/>
+              </w:rPr>
+            </w:pPr>
+            <w:r>
+              <w:rPr>
+                <w:b/>
+                <w:bCs/>
+                <w:color w:val="000000"/>
+                <w:sz w:val="22"/>
+                <w:szCs w:val="22"/>
+              </w:rPr>
+              <w:t xml:space="preserve">Cost per question: LLM calls / latency</w:t>
+            </w:r>
+          </w:p>
+        </w:tc>
+        <w:tc>
+          <w:tcPr>
+            <w:tcW w:w="3699" w:type="dxa"/>
+          </w:tcPr>
+          <w:p>
+            <w:pPr>
+              <w:spacing w:after="40"/>
+              <w:rPr>
+                <w:color w:val="000000"/>
+                <w:sz w:val="22"/>
+                <w:szCs w:val="22"/>
+              </w:rPr>
+            </w:pPr>
+            <w:r>
+              <w:rPr>
+                <w:color w:val="000000"/>
+                <w:sz w:val="22"/>
+                <w:szCs w:val="22"/>
+              </w:rPr>
+              <w:t xml:space="preserve">1 / 1.7 s</w:t>
+            </w:r>
+          </w:p>
+        </w:tc>
+        <w:tc>
+          <w:tcPr>
+            <w:tcW w:w="3699" w:type="dxa"/>
+          </w:tcPr>
+          <w:p>
+            <w:pPr>
+              <w:spacing w:after="40"/>
+              <w:rPr>
+                <w:color w:val="000000"/>
+                <w:sz w:val="22"/>
+                <w:szCs w:val="22"/>
+              </w:rPr>
+            </w:pPr>
+            <w:r>
+              <w:rPr>
+                <w:color w:val="000000"/>
+                <w:sz w:val="22"/>
+                <w:szCs w:val="22"/>
+              </w:rPr>
+              <w:t xml:space="preserve">2 / 4.9 s (+ one-time ~119 calls to extract tool relations, cached)</w:t>
+            </w:r>
+          </w:p>
+        </w:tc>
+      </w:tr>
+      <w:tr>
+        <w:tc>
+          <w:tcPr>
+            <w:tcW w:w="3698" w:type="dxa"/>
+          </w:tcPr>
+          <w:p>
+            <w:pPr>
+              <w:spacing w:after="40"/>
+              <w:rPr>
+                <w:b/>
+                <w:bCs/>
+                <w:color w:val="000000"/>
+                <w:sz w:val="22"/>
+                <w:szCs w:val="22"/>
+              </w:rPr>
+            </w:pPr>
+            <w:r>
+              <w:rPr>
+                <w:b/>
+                <w:bCs/>
+                <w:color w:val="000000"/>
+                <w:sz w:val="22"/>
+                <w:szCs w:val="22"/>
+              </w:rPr>
+              <w:t xml:space="preserve">Extended set Q1–Q6 pass rate (adds Q5 Hectare, Q6 Sketch)</w:t>
+            </w:r>
+          </w:p>
+        </w:tc>
+        <w:tc>
+          <w:tcPr>
+            <w:tcW w:w="3699" w:type="dxa"/>
+          </w:tcPr>
+          <w:p>
+            <w:pPr>
+              <w:spacing w:after="40"/>
+              <w:rPr>
+                <w:color w:val="000000"/>
+                <w:sz w:val="22"/>
+                <w:szCs w:val="22"/>
+              </w:rPr>
+            </w:pPr>
+            <w:r>
+              <w:rPr>
+                <w:color w:val="000000"/>
+                <w:sz w:val="22"/>
+                <w:szCs w:val="22"/>
+              </w:rPr>
+              <w:t xml:space="preserve">2.00 / 6</w:t>
+            </w:r>
+          </w:p>
+        </w:tc>
+        <w:tc>
+          <w:tcPr>
+            <w:tcW w:w="3699" w:type="dxa"/>
+          </w:tcPr>
+          <w:p>
+            <w:pPr>
+              <w:spacing w:after="40"/>
+              <w:rPr>
+                <w:color w:val="000000"/>
+                <w:sz w:val="22"/>
+                <w:szCs w:val="22"/>
+              </w:rPr>
+            </w:pPr>
+            <w:r>
+              <w:rPr>
+                <w:color w:val="000000"/>
+                <w:sz w:val="22"/>
+                <w:szCs w:val="22"/>
+              </w:rPr>
+              <w:t xml:space="preserve">4.00 / 6</w:t>
+            </w:r>
+          </w:p>
+        </w:tc>
+      </w:tr>
+      <w:tr>
+        <w:tc>
+          <w:tcPr>
+            <w:tcW w:w="3698" w:type="dxa"/>
+          </w:tcPr>
+          <w:p>
+            <w:pPr>
+              <w:spacing w:after="40"/>
+              <w:rPr>
+                <w:b/>
+                <w:bCs/>
+                <w:color w:val="000000"/>
+                <w:sz w:val="22"/>
+                <w:szCs w:val="22"/>
+              </w:rPr>
+            </w:pPr>
+            <w:r>
+              <w:rPr>
+                <w:b/>
+                <w:bCs/>
+                <w:color w:val="000000"/>
+                <w:sz w:val="22"/>
+                <w:szCs w:val="22"/>
+              </w:rPr>
+              <w:t xml:space="preserve">Judge validation (known-answer cases, same 3.1 judge)</w:t>
+            </w:r>
+          </w:p>
+        </w:tc>
+        <w:tc>
+          <w:tcPr>
+            <w:tcW w:w="3699" w:type="dxa"/>
+          </w:tcPr>
+          <w:p>
+            <w:pPr>
+              <w:spacing w:after="40"/>
+              <w:rPr>
+                <w:color w:val="000000"/>
+                <w:sz w:val="22"/>
+                <w:szCs w:val="22"/>
+              </w:rPr>
+            </w:pPr>
+            <w:r>
+              <w:rPr>
+                <w:color w:val="000000"/>
+                <w:sz w:val="22"/>
+                <w:szCs w:val="22"/>
+              </w:rPr>
+              <w:t xml:space="preserve">3 / 3</w:t>
+            </w:r>
+          </w:p>
+        </w:tc>
+        <w:tc>
+          <w:tcPr>
+            <w:tcW w:w="3699" w:type="dxa"/>
+          </w:tcPr>
+          <w:p>
+            <w:pPr>
+              <w:spacing w:after="40"/>
+              <w:rPr>
+                <w:color w:val="000000"/>
+                <w:sz w:val="22"/>
+                <w:szCs w:val="22"/>
+              </w:rPr>
+            </w:pPr>
+            <w:r>
+              <w:rPr>
+                <w:color w:val="000000"/>
+                <w:sz w:val="22"/>
+                <w:szCs w:val="22"/>
+              </w:rPr>
+              <w:t xml:space="preserve">3 / 3</w:t>
+            </w:r>
           </w:p>
         </w:tc>
       </w:tr>
@@ -3388,6 +4054,74 @@
                 <w:szCs w:val="24"/>
               </w:rPr>
             </w:pPr>
+            <w:r>
+              <w:rPr>
+                <w:b/>
+                <w:bCs/>
+                <w:sz w:val="24"/>
+                <w:szCs w:val="24"/>
+              </w:rPr>
+              <w:t xml:space="preserve">Q1 (within a paper): </w:t>
+            </w:r>
+            <w:r>
+              <w:rPr>
+                <w:sz w:val="24"/>
+                <w:szCs w:val="24"/>
+              </w:rPr>
+              <w:t xml:space="preserve">How long did the fairness verifier take to verify the deep recurrent neural network with an error probability of 10⁻¹⁰, and how many samples did it need?</w:t>
+            </w:r>
+          </w:p>
+          <w:p>
+            <w:pPr>
+              <w:spacing w:after="120"/>
+              <w:ind w:left="360" w:hanging="200"/>
+              <w:rPr>
+                <w:sz w:val="24"/>
+                <w:szCs w:val="24"/>
+              </w:rPr>
+            </w:pPr>
+            <w:r>
+              <w:rPr>
+                <w:b/>
+                <w:bCs/>
+                <w:sz w:val="24"/>
+                <w:szCs w:val="24"/>
+              </w:rPr>
+              <w:t xml:space="preserve">• Baseline (k=8): </w:t>
+            </w:r>
+            <w:r>
+              <w:rPr>
+                <w:sz w:val="24"/>
+                <w:szCs w:val="24"/>
+              </w:rPr>
+              <w:t xml:space="preserve">the 8 slots held only 4 distinct passages (chunks 53, 0, 42, 43, each from both copies of the paper). Answer: “The provided documents do not give the specific running time or sample count.” FAIL (0/3 runs).</w:t>
+            </w:r>
+          </w:p>
+          <w:p>
+            <w:pPr>
+              <w:spacing w:after="120"/>
+              <w:ind w:left="360" w:hanging="200"/>
+              <w:rPr>
+                <w:sz w:val="24"/>
+                <w:szCs w:val="24"/>
+              </w:rPr>
+            </w:pPr>
+            <w:r>
+              <w:rPr>
+                <w:b/>
+                <w:bCs/>
+                <w:sz w:val="24"/>
+                <w:szCs w:val="24"/>
+              </w:rPr>
+              <w:t xml:space="preserve">• Advanced: </w:t>
+            </w:r>
+            <w:r>
+              <w:rPr>
+                <w:sz w:val="24"/>
+                <w:szCs w:val="24"/>
+              </w:rPr>
+              <w:t xml:space="preserve">scope single → one paper (the arXiv copy skipped via duplicate_of). PRIMARY: chunks 53, 42, 0, 76, 5; CONTEXT: passages 1–3 after PRIMARY 1 = chunks 54, 55, 56. Chunk 56 holds the answer. Answer: VeriFair “terminated in 606 seconds and uses 28,000 samples.” PASS (3/3 runs). See Figure 3.</w:t>
+            </w:r>
           </w:p>
           <w:p>
             <w:pPr>
@@ -3492,6 +4226,74 @@
                 <w:szCs w:val="24"/>
               </w:rPr>
             </w:pPr>
+            <w:r>
+              <w:rPr>
+                <w:b/>
+                <w:bCs/>
+                <w:sz w:val="24"/>
+                <w:szCs w:val="24"/>
+              </w:rPr>
+              <w:t xml:space="preserve">Q3 (paraphrased question, answer deep in the paper): </w:t>
+            </w:r>
+            <w:r>
+              <w:rPr>
+                <w:sz w:val="24"/>
+                <w:szCs w:val="24"/>
+              </w:rPr>
+              <w:t xml:space="preserve">Is there a technique that re-runs a whole computation from the beginning, guided by a log of earlier results… How did its speed compare with a logic-programming language on the queens puzzle?</w:t>
+            </w:r>
+          </w:p>
+          <w:p>
+            <w:pPr>
+              <w:spacing w:after="120"/>
+              <w:ind w:left="360" w:hanging="200"/>
+              <w:rPr>
+                <w:sz w:val="24"/>
+                <w:szCs w:val="24"/>
+              </w:rPr>
+            </w:pPr>
+            <w:r>
+              <w:rPr>
+                <w:b/>
+                <w:bCs/>
+                <w:sz w:val="24"/>
+                <w:szCs w:val="24"/>
+              </w:rPr>
+              <w:t xml:space="preserve">• Baseline (k=8): </w:t>
+            </w:r>
+            <w:r>
+              <w:rPr>
+                <w:sz w:val="24"/>
+                <w:szCs w:val="24"/>
+              </w:rPr>
+              <w:t xml:space="preserve">an unrelated paper (StatusQuo) ranked first and both copies of the right paper took slots; the timings chunk (61) was not retrieved. The answer described the replay idea but gave no Prolog comparison. FAIL (0/3).</w:t>
+            </w:r>
+          </w:p>
+          <w:p>
+            <w:pPr>
+              <w:spacing w:after="120"/>
+              <w:ind w:left="360" w:hanging="200"/>
+              <w:rPr>
+                <w:sz w:val="24"/>
+                <w:szCs w:val="24"/>
+              </w:rPr>
+            </w:pPr>
+            <w:r>
+              <w:rPr>
+                <w:b/>
+                <w:bCs/>
+                <w:sz w:val="24"/>
+                <w:szCs w:val="24"/>
+              </w:rPr>
+              <w:t xml:space="preserve">• Advanced: </w:t>
+            </w:r>
+            <w:r>
+              <w:rPr>
+                <w:sz w:val="24"/>
+                <w:szCs w:val="24"/>
+              </w:rPr>
+              <w:t xml:space="preserve">the sub-queries rephrased the question in technical terms (“replaying … from the initial state using a log of intermediate results”, “N-queens benchmark”); scope single → hop 2 inside the right paper put chunk 61 among the PRIMARY chunks. The run-1 answer named “thermometer continuations” and quoted “For N=13, GNU Prolog takes around 20s, while our slowest ML versions run in 14s.” PASS (3/3).</w:t>
+            </w:r>
           </w:p>
           <w:p>
             <w:pPr>
@@ -3596,6 +4398,200 @@
                 <w:szCs w:val="24"/>
               </w:rPr>
             </w:pPr>
+            <w:r>
+              <w:rPr>
+                <w:b/>
+                <w:bCs/>
+                <w:sz w:val="24"/>
+                <w:szCs w:val="24"/>
+              </w:rPr>
+              <w:t xml:space="preserve">Q2 (across papers, still failing): </w:t>
+            </w:r>
+            <w:r>
+              <w:rPr>
+                <w:sz w:val="24"/>
+                <w:szCs w:val="24"/>
+              </w:rPr>
+              <w:t xml:space="preserve">Which papers compare their approach against an SMT-based tool and argue that SMT solving limits scalability? Name the baseline in each.</w:t>
+            </w:r>
+          </w:p>
+          <w:p>
+            <w:pPr>
+              <w:spacing w:after="120"/>
+              <w:ind w:left="360" w:hanging="200"/>
+              <w:rPr>
+                <w:sz w:val="24"/>
+                <w:szCs w:val="24"/>
+              </w:rPr>
+            </w:pPr>
+            <w:r>
+              <w:rPr>
+                <w:b/>
+                <w:bCs/>
+                <w:sz w:val="24"/>
+                <w:szCs w:val="24"/>
+              </w:rPr>
+              <w:t xml:space="preserve">• Baseline (k=8): </w:t>
+            </w:r>
+            <w:r>
+              <w:rPr>
+                <w:sz w:val="24"/>
+                <w:szCs w:val="24"/>
+              </w:rPr>
+              <w:t xml:space="preserve">MANTRA, which only matches the word “SMT”, filled 4 of 8 slots; none of the expected papers was retrieved. Answer named ReaS (dReal) and Metric Program Synthesis. FAIL.</w:t>
+            </w:r>
+          </w:p>
+          <w:p>
+            <w:pPr>
+              <w:spacing w:after="120"/>
+              <w:ind w:left="360" w:hanging="200"/>
+              <w:rPr>
+                <w:sz w:val="24"/>
+                <w:szCs w:val="24"/>
+              </w:rPr>
+            </w:pPr>
+            <w:r>
+              <w:rPr>
+                <w:b/>
+                <w:bCs/>
+                <w:sz w:val="24"/>
+                <w:szCs w:val="24"/>
+              </w:rPr>
+              <w:t xml:space="preserve">• Advanced: </w:t>
+            </w:r>
+            <w:r>
+              <w:rPr>
+                <w:sz w:val="24"/>
+                <w:szCs w:val="24"/>
+              </w:rPr>
+              <w:t xml:space="preserve">scope multi; papers reached through compares_against relations, e.g. “Castor is compared against the baseline Cozy, which uses an SMT solver…”. Answer named Castor vs Cozy, quoting “Cozy uses an SMT solver to verify candidates, which does not scale”, and ReaS vs dReal. Expected papers retrieved rose from 0/3 to 2/3, but only one listed pair was named, so FAIL (0/3; 1/3 in an earlier run). ReaS is a valid answer missing from the grading notes. See Figure 4.</w:t>
+            </w:r>
+          </w:p>
+          <w:p>
+            <w:pPr>
+              <w:spacing w:after="120"/>
+              <w:rPr>
+                <w:sz w:val="24"/>
+                <w:szCs w:val="24"/>
+              </w:rPr>
+            </w:pPr>
+            <w:r>
+              <w:rPr>
+                <w:b/>
+                <w:bCs/>
+                <w:sz w:val="24"/>
+                <w:szCs w:val="24"/>
+              </w:rPr>
+              <w:t xml:space="preserve">Figure 4. </w:t>
+            </w:r>
+            <w:r>
+              <w:rPr>
+                <w:sz w:val="24"/>
+                <w:szCs w:val="24"/>
+              </w:rPr>
+              <w:t xml:space="preserve">Q2 trace: scope multi, papers reached via compares_against relations.</w:t>
+            </w:r>
+          </w:p>
+          <w:p>
+            <w:pPr>
+              <w:spacing w:after="60"/>
+            </w:pPr>
+            <w:r>
+              <w:drawing>
+                <wp:inline distT="0" distB="0" distL="0" distR="0">
+                  <wp:extent cx="6035040" cy="4828032"/>
+                  <wp:docPr id="9004" name="Figure 4"/>
+                  <a:graphic xmlns:a="http://schemas.openxmlformats.org/drawingml/2006/main">
+                    <a:graphicData uri="http://schemas.openxmlformats.org/drawingml/2006/picture">
+                      <pic:pic xmlns:pic="http://schemas.openxmlformats.org/drawingml/2006/picture">
+                        <pic:nvPicPr>
+                          <pic:cNvPr id="9004" name="cp41_fig4_q2_trace_multi.png"/>
+                          <pic:cNvPicPr/>
+                        </pic:nvPicPr>
+                        <pic:blipFill>
+                          <a:blip r:embed="rIdCp41fig4_q2_trace_multi"/>
+                          <a:stretch>
+                            <a:fillRect/>
+                          </a:stretch>
+                        </pic:blipFill>
+                        <pic:spPr>
+                          <a:xfrm>
+                            <a:off x="0" y="0"/>
+                            <a:ext cx="6035040" cy="4828032"/>
+                          </a:xfrm>
+                          <a:prstGeom prst="rect">
+                            <a:avLst/>
+                          </a:prstGeom>
+                        </pic:spPr>
+                      </pic:pic>
+                    </a:graphicData>
+                  </a:graphic>
+                </wp:inline>
+              </w:drawing>
+            </w:r>
+          </w:p>
+          <w:p>
+            <w:pPr>
+              <w:spacing w:after="120"/>
+              <w:rPr>
+                <w:sz w:val="24"/>
+                <w:szCs w:val="24"/>
+              </w:rPr>
+            </w:pPr>
+            <w:r>
+              <w:rPr>
+                <w:b/>
+                <w:bCs/>
+                <w:sz w:val="24"/>
+                <w:szCs w:val="24"/>
+              </w:rPr>
+              <w:t xml:space="preserve">Figure 5. </w:t>
+            </w:r>
+            <w:r>
+              <w:rPr>
+                <w:sz w:val="24"/>
+                <w:szCs w:val="24"/>
+              </w:rPr>
+              <w:t xml:space="preserve">Full evaluation output (5 systems, 3 runs each, matched 8-chunk budget).</w:t>
+            </w:r>
+          </w:p>
+          <w:p>
+            <w:pPr>
+              <w:spacing w:after="60"/>
+            </w:pPr>
+            <w:r>
+              <w:drawing>
+                <wp:inline distT="0" distB="0" distL="0" distR="0">
+                  <wp:extent cx="6035040" cy="2865332"/>
+                  <wp:docPr id="9005" name="Figure 5"/>
+                  <a:graphic xmlns:a="http://schemas.openxmlformats.org/drawingml/2006/main">
+                    <a:graphicData uri="http://schemas.openxmlformats.org/drawingml/2006/picture">
+                      <pic:pic xmlns:pic="http://schemas.openxmlformats.org/drawingml/2006/picture">
+                        <pic:nvPicPr>
+                          <pic:cNvPr id="9005" name="cp41_fig5_results.png"/>
+                          <pic:cNvPicPr/>
+                        </pic:nvPicPr>
+                        <pic:blipFill>
+                          <a:blip r:embed="rIdCp41fig5_results"/>
+                          <a:stretch>
+                            <a:fillRect/>
+                          </a:stretch>
+                        </pic:blipFill>
+                        <pic:spPr>
+                          <a:xfrm>
+                            <a:off x="0" y="0"/>
+                            <a:ext cx="6035040" cy="2865332"/>
+                          </a:xfrm>
+                          <a:prstGeom prst="rect">
+                            <a:avLst/>
+                          </a:prstGeom>
+                        </pic:spPr>
+                      </pic:pic>
+                    </a:graphicData>
+                  </a:graphic>
+                </wp:inline>
+              </w:drawing>
+            </w:r>
           </w:p>
           <w:p>
             <w:pPr>

</xml_diff>

<commit_message>
Complete Checkpoint 4.1 worksheet (Steps 6-7) and mark 4.1 complete
</commit_message>
<xml_diff>
--- a/Capstone_Checkpoint_4.1/Tarundeep_Required_Capstone_Checkpoint_4_1_Worksheet.docx
+++ b/Capstone_Checkpoint_4.1/Tarundeep_Required_Capstone_Checkpoint_4_1_Worksheet.docx
@@ -4818,11 +4818,132 @@
           <w:p>
             <w:pPr>
               <w:spacing w:after="120"/>
-              <w:rPr>
-                <w:sz w:val="24"/>
-                <w:szCs w:val="24"/>
-              </w:rPr>
-            </w:pPr>
+              <w:ind w:left="360" w:hanging="200"/>
+              <w:rPr>
+                <w:sz w:val="24"/>
+                <w:szCs w:val="24"/>
+              </w:rPr>
+            </w:pPr>
+            <w:r>
+              <w:rPr>
+                <w:b/>
+                <w:bCs/>
+                <w:sz w:val="24"/>
+                <w:szCs w:val="24"/>
+              </w:rPr>
+              <w:t xml:space="preserve">• Pass rate: </w:t>
+            </w:r>
+            <w:r>
+              <w:rPr>
+                <w:sz w:val="24"/>
+                <w:szCs w:val="24"/>
+              </w:rPr>
+              <w:t xml:space="preserve">1.00 → 3.00 / 4 at the same 8-chunk budget; answer evidence reached the LLM 22% → 78%.</w:t>
+            </w:r>
+          </w:p>
+          <w:p>
+            <w:pPr>
+              <w:spacing w:after="120"/>
+              <w:ind w:left="360" w:hanging="200"/>
+              <w:rPr>
+                <w:sz w:val="24"/>
+                <w:szCs w:val="24"/>
+              </w:rPr>
+            </w:pPr>
+            <w:r>
+              <w:rPr>
+                <w:b/>
+                <w:bCs/>
+                <w:sz w:val="24"/>
+                <w:szCs w:val="24"/>
+              </w:rPr>
+              <w:t xml:space="preserve">• Within a paper: </w:t>
+            </w:r>
+            <w:r>
+              <w:rPr>
+                <w:sz w:val="24"/>
+                <w:szCs w:val="24"/>
+              </w:rPr>
+              <w:t xml:space="preserve">Q1 and Q3 went from 0/3 to 3/3 (next_chunk reached chunk 56; searching inside the paper found chunk 61).</w:t>
+            </w:r>
+          </w:p>
+          <w:p>
+            <w:pPr>
+              <w:spacing w:after="120"/>
+              <w:ind w:left="360" w:hanging="200"/>
+              <w:rPr>
+                <w:sz w:val="24"/>
+                <w:szCs w:val="24"/>
+              </w:rPr>
+            </w:pPr>
+            <w:r>
+              <w:rPr>
+                <w:b/>
+                <w:bCs/>
+                <w:sz w:val="24"/>
+                <w:szCs w:val="24"/>
+              </w:rPr>
+              <w:t xml:space="preserve">• Duplicates: </w:t>
+            </w:r>
+            <w:r>
+              <w:rPr>
+                <w:sz w:val="24"/>
+                <w:szCs w:val="24"/>
+              </w:rPr>
+              <w:t xml:space="preserve">eliminated by duplicate_of; 8 distinct passages instead of 6.5.</w:t>
+            </w:r>
+          </w:p>
+          <w:p>
+            <w:pPr>
+              <w:spacing w:after="120"/>
+              <w:ind w:left="360" w:hanging="200"/>
+              <w:rPr>
+                <w:sz w:val="24"/>
+                <w:szCs w:val="24"/>
+              </w:rPr>
+            </w:pPr>
+            <w:r>
+              <w:rPr>
+                <w:b/>
+                <w:bCs/>
+                <w:sz w:val="24"/>
+                <w:szCs w:val="24"/>
+              </w:rPr>
+              <w:t xml:space="preserve">• Across papers (partly): </w:t>
+            </w:r>
+            <w:r>
+              <w:rPr>
+                <w:sz w:val="24"/>
+                <w:szCs w:val="24"/>
+              </w:rPr>
+              <w:t xml:space="preserve">expected papers retrieved 50% → 72%; Q2 now finds Castor vs Cozy through compares_against.</w:t>
+            </w:r>
+          </w:p>
+          <w:p>
+            <w:pPr>
+              <w:spacing w:after="120"/>
+              <w:ind w:left="360" w:hanging="200"/>
+              <w:rPr>
+                <w:sz w:val="24"/>
+                <w:szCs w:val="24"/>
+              </w:rPr>
+            </w:pPr>
+            <w:r>
+              <w:rPr>
+                <w:b/>
+                <w:bCs/>
+                <w:sz w:val="24"/>
+                <w:szCs w:val="24"/>
+              </w:rPr>
+              <w:t xml:space="preserve">• Both techniques were needed: </w:t>
+            </w:r>
+            <w:r>
+              <w:rPr>
+                <w:sz w:val="24"/>
+                <w:szCs w:val="24"/>
+              </w:rPr>
+              <w:t xml:space="preserve">decomposition only 0.67/4, graph only 1.00/4, combined 3.00/4.</w:t>
+            </w:r>
           </w:p>
         </w:tc>
       </w:tr>
@@ -4904,11 +5025,132 @@
           <w:p>
             <w:pPr>
               <w:spacing w:after="120"/>
-              <w:rPr>
-                <w:sz w:val="24"/>
-                <w:szCs w:val="24"/>
-              </w:rPr>
-            </w:pPr>
+              <w:ind w:left="360" w:hanging="200"/>
+              <w:rPr>
+                <w:sz w:val="24"/>
+                <w:szCs w:val="24"/>
+              </w:rPr>
+            </w:pPr>
+            <w:r>
+              <w:rPr>
+                <w:b/>
+                <w:bCs/>
+                <w:sz w:val="24"/>
+                <w:szCs w:val="24"/>
+              </w:rPr>
+              <w:t xml:space="preserve">• Q2 still fails (0/3): </w:t>
+            </w:r>
+            <w:r>
+              <w:rPr>
+                <w:sz w:val="24"/>
+                <w:szCs w:val="24"/>
+              </w:rPr>
+              <w:t xml:space="preserve">many papers compare against SMT solvers, so VeriFair and Hectare often miss the 8-paper cut.</w:t>
+            </w:r>
+          </w:p>
+          <w:p>
+            <w:pPr>
+              <w:spacing w:after="120"/>
+              <w:ind w:left="360" w:hanging="200"/>
+              <w:rPr>
+                <w:sz w:val="24"/>
+                <w:szCs w:val="24"/>
+              </w:rPr>
+            </w:pPr>
+            <w:r>
+              <w:rPr>
+                <w:b/>
+                <w:bCs/>
+                <w:sz w:val="24"/>
+                <w:szCs w:val="24"/>
+              </w:rPr>
+              <w:t xml:space="preserve">• Cost: </w:t>
+            </w:r>
+            <w:r>
+              <w:rPr>
+                <w:sz w:val="24"/>
+                <w:szCs w:val="24"/>
+              </w:rPr>
+              <w:t xml:space="preserve">2 LLM calls and ~5 s per question vs 1 call and ~2 s, plus a one-time extraction (~119 calls).</w:t>
+            </w:r>
+          </w:p>
+          <w:p>
+            <w:pPr>
+              <w:spacing w:after="120"/>
+              <w:ind w:left="360" w:hanging="200"/>
+              <w:rPr>
+                <w:sz w:val="24"/>
+                <w:szCs w:val="24"/>
+              </w:rPr>
+            </w:pPr>
+            <w:r>
+              <w:rPr>
+                <w:b/>
+                <w:bCs/>
+                <w:sz w:val="24"/>
+                <w:szCs w:val="24"/>
+              </w:rPr>
+              <w:t xml:space="preserve">• Noisy context: </w:t>
+            </w:r>
+            <w:r>
+              <w:rPr>
+                <w:sz w:val="24"/>
+                <w:szCs w:val="24"/>
+              </w:rPr>
+              <w:t xml:space="preserve">topic edges linked unrelated papers (dropped); a cut-off passage once led the LLM to invent “34,000 samples”.</w:t>
+            </w:r>
+          </w:p>
+          <w:p>
+            <w:pPr>
+              <w:spacing w:after="120"/>
+              <w:ind w:left="360" w:hanging="200"/>
+              <w:rPr>
+                <w:sz w:val="24"/>
+                <w:szCs w:val="24"/>
+              </w:rPr>
+            </w:pPr>
+            <w:r>
+              <w:rPr>
+                <w:b/>
+                <w:bCs/>
+                <w:sz w:val="24"/>
+                <w:szCs w:val="24"/>
+              </w:rPr>
+              <w:t xml:space="preserve">• LLM-made data: </w:t>
+            </w:r>
+            <w:r>
+              <w:rPr>
+                <w:sz w:val="24"/>
+                <w:szCs w:val="24"/>
+              </w:rPr>
+              <w:t xml:space="preserve">extracted relations can be wrong (e.g. “FairSqare”), and the single/multi plan can misclassify.</w:t>
+            </w:r>
+          </w:p>
+          <w:p>
+            <w:pPr>
+              <w:spacing w:after="120"/>
+              <w:ind w:left="360" w:hanging="200"/>
+              <w:rPr>
+                <w:sz w:val="24"/>
+                <w:szCs w:val="24"/>
+              </w:rPr>
+            </w:pPr>
+            <w:r>
+              <w:rPr>
+                <w:b/>
+                <w:bCs/>
+                <w:sz w:val="24"/>
+                <w:szCs w:val="24"/>
+              </w:rPr>
+              <w:t xml:space="preserve">• Evaluation: </w:t>
+            </w:r>
+            <w:r>
+              <w:rPr>
+                <w:sz w:val="24"/>
+                <w:szCs w:val="24"/>
+              </w:rPr>
+              <w:t xml:space="preserve">4 questions, 3 runs, results vary between runs; same model answers and judges; grading notes miss valid answers (ReaS in Q2, Q6).</w:t>
+            </w:r>
           </w:p>
         </w:tc>
       </w:tr>
@@ -5002,6 +5244,13 @@
                 <w:szCs w:val="24"/>
               </w:rPr>
             </w:pPr>
+            <w:r>
+              <w:rPr>
+                <w:sz w:val="24"/>
+                <w:szCs w:val="24"/>
+              </w:rPr>
+              <w:t xml:space="preserve">Mostly. The within-paper failure is fixed reliably (Q1, Q3: 0/3 → 3/3) and duplicate slots are gone. The across-paper failure is only partly fixed: the right papers reach the LLM more often, but not reliably enough for Q2 to pass.</w:t>
+            </w:r>
           </w:p>
         </w:tc>
       </w:tr>
@@ -5170,11 +5419,106 @@
           <w:p>
             <w:pPr>
               <w:spacing w:after="120"/>
-              <w:rPr>
-                <w:sz w:val="24"/>
-                <w:szCs w:val="24"/>
-              </w:rPr>
-            </w:pPr>
+              <w:ind w:left="360" w:hanging="200"/>
+              <w:rPr>
+                <w:sz w:val="24"/>
+                <w:szCs w:val="24"/>
+              </w:rPr>
+            </w:pPr>
+            <w:r>
+              <w:rPr>
+                <w:b/>
+                <w:bCs/>
+                <w:sz w:val="24"/>
+                <w:szCs w:val="24"/>
+              </w:rPr>
+              <w:t xml:space="preserve">• The problem was the data, not the wording. </w:t>
+            </w:r>
+            <w:r>
+              <w:rPr>
+                <w:sz w:val="24"/>
+                <w:szCs w:val="24"/>
+              </w:rPr>
+              <w:t xml:space="preserve">Rewriting queries alone helped little and inconsistently (0.67/4 in the final run, 1.67/4 in an earlier one); representing relationships made the difference.</w:t>
+            </w:r>
+          </w:p>
+          <w:p>
+            <w:pPr>
+              <w:spacing w:after="120"/>
+              <w:ind w:left="360" w:hanging="200"/>
+              <w:rPr>
+                <w:sz w:val="24"/>
+                <w:szCs w:val="24"/>
+              </w:rPr>
+            </w:pPr>
+            <w:r>
+              <w:rPr>
+                <w:b/>
+                <w:bCs/>
+                <w:sz w:val="24"/>
+                <w:szCs w:val="24"/>
+              </w:rPr>
+              <w:t xml:space="preserve">• A graph needs good starting points. </w:t>
+            </w:r>
+            <w:r>
+              <w:rPr>
+                <w:sz w:val="24"/>
+                <w:szCs w:val="24"/>
+              </w:rPr>
+              <w:t xml:space="preserve">Alone it scored 1.00/4, as Lab 4.2 warned; decomposition supplies the starting papers and the single/multi plan.</w:t>
+            </w:r>
+          </w:p>
+          <w:p>
+            <w:pPr>
+              <w:spacing w:after="120"/>
+              <w:ind w:left="360" w:hanging="200"/>
+              <w:rPr>
+                <w:sz w:val="24"/>
+                <w:szCs w:val="24"/>
+              </w:rPr>
+            </w:pPr>
+            <w:r>
+              <w:rPr>
+                <w:b/>
+                <w:bCs/>
+                <w:sz w:val="24"/>
+                <w:szCs w:val="24"/>
+              </w:rPr>
+              <w:t xml:space="preserve">• Every edge must earn its place. </w:t>
+            </w:r>
+            <w:r>
+              <w:rPr>
+                <w:sz w:val="24"/>
+                <w:szCs w:val="24"/>
+              </w:rPr>
+              <w:t xml:space="preserve">Generic edges (shared topics) added noise; specific ones (next_chunk, compares_against) fixed measured failures.</w:t>
+            </w:r>
+          </w:p>
+          <w:p>
+            <w:pPr>
+              <w:spacing w:after="120"/>
+              <w:ind w:left="360" w:hanging="200"/>
+              <w:rPr>
+                <w:sz w:val="24"/>
+                <w:szCs w:val="24"/>
+              </w:rPr>
+            </w:pPr>
+            <w:r>
+              <w:rPr>
+                <w:b/>
+                <w:bCs/>
+                <w:sz w:val="24"/>
+                <w:szCs w:val="24"/>
+              </w:rPr>
+              <w:t xml:space="preserve">• More context is not better. </w:t>
+            </w:r>
+            <w:r>
+              <w:rPr>
+                <w:sz w:val="24"/>
+                <w:szCs w:val="24"/>
+              </w:rPr>
+              <w:t xml:space="preserve">A fixed, labelled budget beat simply raising k, and following reading order beat re-ranking by similarity.</w:t>
+            </w:r>
           </w:p>
           <w:p>
             <w:pPr>
@@ -5283,11 +5627,106 @@
           <w:p>
             <w:pPr>
               <w:spacing w:after="120"/>
-              <w:rPr>
-                <w:sz w:val="24"/>
-                <w:szCs w:val="24"/>
-              </w:rPr>
-            </w:pPr>
+              <w:ind w:left="360" w:hanging="200"/>
+              <w:rPr>
+                <w:sz w:val="24"/>
+                <w:szCs w:val="24"/>
+              </w:rPr>
+            </w:pPr>
+            <w:r>
+              <w:rPr>
+                <w:b/>
+                <w:bCs/>
+                <w:sz w:val="24"/>
+                <w:szCs w:val="24"/>
+              </w:rPr>
+              <w:t xml:space="preserve">• Q2: </w:t>
+            </w:r>
+            <w:r>
+              <w:rPr>
+                <w:sz w:val="24"/>
+                <w:szCs w:val="24"/>
+              </w:rPr>
+              <w:t xml:space="preserve">a larger budget or a reranker for multi-paper questions; citation edges from GROBID reference lists.</w:t>
+            </w:r>
+          </w:p>
+          <w:p>
+            <w:pPr>
+              <w:spacing w:after="120"/>
+              <w:ind w:left="360" w:hanging="200"/>
+              <w:rPr>
+                <w:sz w:val="24"/>
+                <w:szCs w:val="24"/>
+              </w:rPr>
+            </w:pPr>
+            <w:r>
+              <w:rPr>
+                <w:b/>
+                <w:bCs/>
+                <w:sz w:val="24"/>
+                <w:szCs w:val="24"/>
+              </w:rPr>
+              <w:t xml:space="preserve">• Grounding check: </w:t>
+            </w:r>
+            <w:r>
+              <w:rPr>
+                <w:sz w:val="24"/>
+                <w:szCs w:val="24"/>
+              </w:rPr>
+              <w:t xml:space="preserve">verify quoted numbers against the retrieved chunks to catch invented values.</w:t>
+            </w:r>
+          </w:p>
+          <w:p>
+            <w:pPr>
+              <w:spacing w:after="120"/>
+              <w:ind w:left="360" w:hanging="200"/>
+              <w:rPr>
+                <w:sz w:val="24"/>
+                <w:szCs w:val="24"/>
+              </w:rPr>
+            </w:pPr>
+            <w:r>
+              <w:rPr>
+                <w:b/>
+                <w:bCs/>
+                <w:sz w:val="24"/>
+                <w:szCs w:val="24"/>
+              </w:rPr>
+              <w:t xml:space="preserve">• Evaluation: </w:t>
+            </w:r>
+            <w:r>
+              <w:rPr>
+                <w:sz w:val="24"/>
+                <w:szCs w:val="24"/>
+              </w:rPr>
+              <w:t xml:space="preserve">more questions (trend, follow-up, out-of-corpus), grading notes that accept valid alternatives, a “partial” verdict, a different judge model, more runs.</w:t>
+            </w:r>
+          </w:p>
+          <w:p>
+            <w:pPr>
+              <w:spacing w:after="120"/>
+              <w:ind w:left="360" w:hanging="200"/>
+              <w:rPr>
+                <w:sz w:val="24"/>
+                <w:szCs w:val="24"/>
+              </w:rPr>
+            </w:pPr>
+            <w:r>
+              <w:rPr>
+                <w:b/>
+                <w:bCs/>
+                <w:sz w:val="24"/>
+                <w:szCs w:val="24"/>
+              </w:rPr>
+              <w:t xml:space="preserve">• Engineering: </w:t>
+            </w:r>
+            <w:r>
+              <w:rPr>
+                <w:sz w:val="24"/>
+                <w:szCs w:val="24"/>
+              </w:rPr>
+              <w:t xml:space="preserve">store the graph instead of rebuilding it, and cache sub-queries to reduce latency.</w:t>
+            </w:r>
           </w:p>
           <w:p>
             <w:pPr>

</xml_diff>